<commit_message>
Fix the 23 audit findings across prose, tables, references, and layout
Restrict the Romania-robustness direction claim to the NEET equations
and report its p-value with the threshold convention; correct the
Baltic-states and lowest-readiness sentences; sign the factor-NEET
correlation; align the Autor et al. (2024) paraphrase with the paper's
actual finding; repair the De Grip and Van Loo chapter imprint and the
two Eurostat dataset codes; widen Table 1 columns and make statistical
parentheticals unbreakable in Tables 6-7; keep headings with their
first paragraph; state the cluster-method agreement precisely in the
cover letter; add the journal's Abbreviations back-matter block.

Co-Authored-By: Claude Fable 5 <noreply@anthropic.com>
Claude-Session: https://claude.ai/code/session_01MZQ6GENDPYhPqohPF23N4M
</commit_message>
<xml_diff>
--- a/ai-youth-eu/AI_Readiness_Youth_Employment_EU_Systems_manuscript.docx
+++ b/ai-youth-eu/AI_Readiness_Youth_Employment_EU_Systems_manuscript.docx
@@ -999,7 +999,7 @@
           <w:b w:val="0"/>
           <w:i w:val="0"/>
         </w:rPr>
-        <w:t xml:space="preserve"> document that most contemporary occupations contain work that did not exist a generation ago. For the generative wave specifically, occupational exposure measurement shows that the affected tasks are concentrated in clerical, analytical, and information-processing work </w:t>
+        <w:t xml:space="preserve"> document that most contemporary employment is in kinds of work that did not exist in 1940. For the generative wave specifically, occupational exposure measurement shows that the affected tasks are concentrated in clerical, analytical, and information-processing work </w:t>
       </w:r>
       <w:r>
         <w:t>[</w:t>
@@ -2989,10 +2989,10 @@
         <w:tblLook w:firstColumn="1" w:firstRow="1" w:lastColumn="0" w:lastRow="0" w:noHBand="0" w:noVBand="1" w:val="04A0"/>
       </w:tblPr>
       <w:tblGrid>
-        <w:gridCol w:w="864"/>
-        <w:gridCol w:w="2828"/>
-        <w:gridCol w:w="2750"/>
-        <w:gridCol w:w="1414"/>
+        <w:gridCol w:w="1100"/>
+        <w:gridCol w:w="2514"/>
+        <w:gridCol w:w="2514"/>
+        <w:gridCol w:w="1728"/>
       </w:tblGrid>
       <w:tr>
         <w:trPr>
@@ -3001,7 +3001,7 @@
         </w:trPr>
         <w:tc>
           <w:tcPr>
-            <w:tcW w:type="dxa" w:w="864"/>
+            <w:tcW w:type="dxa" w:w="1100"/>
             <w:tcBorders>
               <w:bottom w:val="single" w:sz="8" w:space="0" w:color="auto"/>
             </w:tcBorders>
@@ -3025,7 +3025,7 @@
         </w:tc>
         <w:tc>
           <w:tcPr>
-            <w:tcW w:type="dxa" w:w="2828"/>
+            <w:tcW w:type="dxa" w:w="2514"/>
             <w:tcBorders>
               <w:bottom w:val="single" w:sz="8" w:space="0" w:color="auto"/>
             </w:tcBorders>
@@ -3049,7 +3049,7 @@
         </w:tc>
         <w:tc>
           <w:tcPr>
-            <w:tcW w:type="dxa" w:w="2750"/>
+            <w:tcW w:type="dxa" w:w="2514"/>
             <w:tcBorders>
               <w:bottom w:val="single" w:sz="8" w:space="0" w:color="auto"/>
             </w:tcBorders>
@@ -3073,7 +3073,7 @@
         </w:tc>
         <w:tc>
           <w:tcPr>
-            <w:tcW w:type="dxa" w:w="1414"/>
+            <w:tcW w:type="dxa" w:w="1728"/>
             <w:tcBorders>
               <w:bottom w:val="single" w:sz="8" w:space="0" w:color="auto"/>
             </w:tcBorders>
@@ -3102,7 +3102,7 @@
         </w:trPr>
         <w:tc>
           <w:tcPr>
-            <w:tcW w:type="dxa" w:w="864"/>
+            <w:tcW w:type="dxa" w:w="1100"/>
           </w:tcPr>
           <w:p>
             <w:pPr>
@@ -3123,7 +3123,7 @@
         </w:tc>
         <w:tc>
           <w:tcPr>
-            <w:tcW w:type="dxa" w:w="2828"/>
+            <w:tcW w:type="dxa" w:w="2514"/>
           </w:tcPr>
           <w:p>
             <w:pPr>
@@ -3144,7 +3144,7 @@
         </w:tc>
         <w:tc>
           <w:tcPr>
-            <w:tcW w:type="dxa" w:w="2750"/>
+            <w:tcW w:type="dxa" w:w="2514"/>
           </w:tcPr>
           <w:p>
             <w:pPr>
@@ -3165,7 +3165,7 @@
         </w:tc>
         <w:tc>
           <w:tcPr>
-            <w:tcW w:type="dxa" w:w="1414"/>
+            <w:tcW w:type="dxa" w:w="1728"/>
           </w:tcPr>
           <w:p>
             <w:pPr>
@@ -3191,7 +3191,7 @@
         </w:trPr>
         <w:tc>
           <w:tcPr>
-            <w:tcW w:type="dxa" w:w="864"/>
+            <w:tcW w:type="dxa" w:w="1100"/>
           </w:tcPr>
           <w:p>
             <w:pPr>
@@ -3212,7 +3212,7 @@
         </w:tc>
         <w:tc>
           <w:tcPr>
-            <w:tcW w:type="dxa" w:w="2828"/>
+            <w:tcW w:type="dxa" w:w="2514"/>
           </w:tcPr>
           <w:p>
             <w:pPr>
@@ -3233,7 +3233,7 @@
         </w:tc>
         <w:tc>
           <w:tcPr>
-            <w:tcW w:type="dxa" w:w="2750"/>
+            <w:tcW w:type="dxa" w:w="2514"/>
           </w:tcPr>
           <w:p>
             <w:pPr>
@@ -3254,7 +3254,7 @@
         </w:tc>
         <w:tc>
           <w:tcPr>
-            <w:tcW w:type="dxa" w:w="1414"/>
+            <w:tcW w:type="dxa" w:w="1728"/>
           </w:tcPr>
           <w:p>
             <w:pPr>
@@ -3269,7 +3269,7 @@
                 <w:i w:val="0"/>
                 <w:sz w:val="18"/>
               </w:rPr>
-              <w:t>ICT survey 2025</w:t>
+              <w:t>isoc_ci_ax_i</w:t>
             </w:r>
           </w:p>
         </w:tc>
@@ -3280,7 +3280,7 @@
         </w:trPr>
         <w:tc>
           <w:tcPr>
-            <w:tcW w:type="dxa" w:w="864"/>
+            <w:tcW w:type="dxa" w:w="1100"/>
           </w:tcPr>
           <w:p>
             <w:pPr>
@@ -3301,7 +3301,7 @@
         </w:tc>
         <w:tc>
           <w:tcPr>
-            <w:tcW w:type="dxa" w:w="2828"/>
+            <w:tcW w:type="dxa" w:w="2514"/>
           </w:tcPr>
           <w:p>
             <w:pPr>
@@ -3322,7 +3322,7 @@
         </w:tc>
         <w:tc>
           <w:tcPr>
-            <w:tcW w:type="dxa" w:w="2750"/>
+            <w:tcW w:type="dxa" w:w="2514"/>
           </w:tcPr>
           <w:p>
             <w:pPr>
@@ -3343,7 +3343,7 @@
         </w:tc>
         <w:tc>
           <w:tcPr>
-            <w:tcW w:type="dxa" w:w="1414"/>
+            <w:tcW w:type="dxa" w:w="1728"/>
           </w:tcPr>
           <w:p>
             <w:pPr>
@@ -3369,7 +3369,7 @@
         </w:trPr>
         <w:tc>
           <w:tcPr>
-            <w:tcW w:type="dxa" w:w="864"/>
+            <w:tcW w:type="dxa" w:w="1100"/>
           </w:tcPr>
           <w:p>
             <w:pPr>
@@ -3390,7 +3390,7 @@
         </w:tc>
         <w:tc>
           <w:tcPr>
-            <w:tcW w:type="dxa" w:w="2828"/>
+            <w:tcW w:type="dxa" w:w="2514"/>
           </w:tcPr>
           <w:p>
             <w:pPr>
@@ -3411,7 +3411,7 @@
         </w:tc>
         <w:tc>
           <w:tcPr>
-            <w:tcW w:type="dxa" w:w="2750"/>
+            <w:tcW w:type="dxa" w:w="2514"/>
           </w:tcPr>
           <w:p>
             <w:pPr>
@@ -3432,7 +3432,7 @@
         </w:tc>
         <w:tc>
           <w:tcPr>
-            <w:tcW w:type="dxa" w:w="1414"/>
+            <w:tcW w:type="dxa" w:w="1728"/>
           </w:tcPr>
           <w:p>
             <w:pPr>
@@ -3458,7 +3458,7 @@
         </w:trPr>
         <w:tc>
           <w:tcPr>
-            <w:tcW w:type="dxa" w:w="864"/>
+            <w:tcW w:type="dxa" w:w="1100"/>
           </w:tcPr>
           <w:p>
             <w:pPr>
@@ -3479,7 +3479,7 @@
         </w:tc>
         <w:tc>
           <w:tcPr>
-            <w:tcW w:type="dxa" w:w="2828"/>
+            <w:tcW w:type="dxa" w:w="2514"/>
           </w:tcPr>
           <w:p>
             <w:pPr>
@@ -3500,7 +3500,7 @@
         </w:tc>
         <w:tc>
           <w:tcPr>
-            <w:tcW w:type="dxa" w:w="2750"/>
+            <w:tcW w:type="dxa" w:w="2514"/>
           </w:tcPr>
           <w:p>
             <w:pPr>
@@ -3521,7 +3521,7 @@
         </w:tc>
         <w:tc>
           <w:tcPr>
-            <w:tcW w:type="dxa" w:w="1414"/>
+            <w:tcW w:type="dxa" w:w="1728"/>
           </w:tcPr>
           <w:p>
             <w:pPr>
@@ -3547,7 +3547,7 @@
         </w:trPr>
         <w:tc>
           <w:tcPr>
-            <w:tcW w:type="dxa" w:w="864"/>
+            <w:tcW w:type="dxa" w:w="1100"/>
           </w:tcPr>
           <w:p>
             <w:pPr>
@@ -3568,7 +3568,7 @@
         </w:tc>
         <w:tc>
           <w:tcPr>
-            <w:tcW w:type="dxa" w:w="2828"/>
+            <w:tcW w:type="dxa" w:w="2514"/>
           </w:tcPr>
           <w:p>
             <w:pPr>
@@ -3589,7 +3589,7 @@
         </w:tc>
         <w:tc>
           <w:tcPr>
-            <w:tcW w:type="dxa" w:w="2750"/>
+            <w:tcW w:type="dxa" w:w="2514"/>
           </w:tcPr>
           <w:p>
             <w:pPr>
@@ -3610,7 +3610,7 @@
         </w:tc>
         <w:tc>
           <w:tcPr>
-            <w:tcW w:type="dxa" w:w="1414"/>
+            <w:tcW w:type="dxa" w:w="1728"/>
           </w:tcPr>
           <w:p>
             <w:pPr>
@@ -3636,7 +3636,7 @@
         </w:trPr>
         <w:tc>
           <w:tcPr>
-            <w:tcW w:type="dxa" w:w="864"/>
+            <w:tcW w:type="dxa" w:w="1100"/>
           </w:tcPr>
           <w:p>
             <w:pPr>
@@ -3657,7 +3657,7 @@
         </w:tc>
         <w:tc>
           <w:tcPr>
-            <w:tcW w:type="dxa" w:w="2828"/>
+            <w:tcW w:type="dxa" w:w="2514"/>
           </w:tcPr>
           <w:p>
             <w:pPr>
@@ -3678,7 +3678,7 @@
         </w:tc>
         <w:tc>
           <w:tcPr>
-            <w:tcW w:type="dxa" w:w="2750"/>
+            <w:tcW w:type="dxa" w:w="2514"/>
           </w:tcPr>
           <w:p>
             <w:pPr>
@@ -3699,7 +3699,7 @@
         </w:tc>
         <w:tc>
           <w:tcPr>
-            <w:tcW w:type="dxa" w:w="1414"/>
+            <w:tcW w:type="dxa" w:w="1728"/>
           </w:tcPr>
           <w:p>
             <w:pPr>
@@ -3725,7 +3725,7 @@
         </w:trPr>
         <w:tc>
           <w:tcPr>
-            <w:tcW w:type="dxa" w:w="864"/>
+            <w:tcW w:type="dxa" w:w="1100"/>
           </w:tcPr>
           <w:p>
             <w:pPr>
@@ -3746,7 +3746,7 @@
         </w:tc>
         <w:tc>
           <w:tcPr>
-            <w:tcW w:type="dxa" w:w="2828"/>
+            <w:tcW w:type="dxa" w:w="2514"/>
           </w:tcPr>
           <w:p>
             <w:pPr>
@@ -3767,7 +3767,7 @@
         </w:tc>
         <w:tc>
           <w:tcPr>
-            <w:tcW w:type="dxa" w:w="2750"/>
+            <w:tcW w:type="dxa" w:w="2514"/>
           </w:tcPr>
           <w:p>
             <w:pPr>
@@ -3788,7 +3788,7 @@
         </w:tc>
         <w:tc>
           <w:tcPr>
-            <w:tcW w:type="dxa" w:w="1414"/>
+            <w:tcW w:type="dxa" w:w="1728"/>
           </w:tcPr>
           <w:p>
             <w:pPr>
@@ -3803,7 +3803,7 @@
                 <w:i w:val="0"/>
                 <w:sz w:val="18"/>
               </w:rPr>
-              <w:t>prc_ppp_ind</w:t>
+              <w:t>tec00114</w:t>
             </w:r>
           </w:p>
         </w:tc>
@@ -3814,7 +3814,7 @@
         </w:trPr>
         <w:tc>
           <w:tcPr>
-            <w:tcW w:type="dxa" w:w="864"/>
+            <w:tcW w:type="dxa" w:w="1100"/>
           </w:tcPr>
           <w:p>
             <w:pPr>
@@ -3835,7 +3835,7 @@
         </w:tc>
         <w:tc>
           <w:tcPr>
-            <w:tcW w:type="dxa" w:w="2828"/>
+            <w:tcW w:type="dxa" w:w="2514"/>
           </w:tcPr>
           <w:p>
             <w:pPr>
@@ -3856,7 +3856,7 @@
         </w:tc>
         <w:tc>
           <w:tcPr>
-            <w:tcW w:type="dxa" w:w="2750"/>
+            <w:tcW w:type="dxa" w:w="2514"/>
           </w:tcPr>
           <w:p>
             <w:pPr>
@@ -3877,7 +3877,7 @@
         </w:tc>
         <w:tc>
           <w:tcPr>
-            <w:tcW w:type="dxa" w:w="1414"/>
+            <w:tcW w:type="dxa" w:w="1728"/>
           </w:tcPr>
           <w:p>
             <w:pPr>
@@ -3903,7 +3903,7 @@
         </w:trPr>
         <w:tc>
           <w:tcPr>
-            <w:tcW w:type="dxa" w:w="864"/>
+            <w:tcW w:type="dxa" w:w="1100"/>
           </w:tcPr>
           <w:p>
             <w:pPr>
@@ -3924,7 +3924,7 @@
         </w:tc>
         <w:tc>
           <w:tcPr>
-            <w:tcW w:type="dxa" w:w="2828"/>
+            <w:tcW w:type="dxa" w:w="2514"/>
           </w:tcPr>
           <w:p>
             <w:pPr>
@@ -3945,7 +3945,7 @@
         </w:tc>
         <w:tc>
           <w:tcPr>
-            <w:tcW w:type="dxa" w:w="2750"/>
+            <w:tcW w:type="dxa" w:w="2514"/>
           </w:tcPr>
           <w:p>
             <w:pPr>
@@ -3966,7 +3966,7 @@
         </w:tc>
         <w:tc>
           <w:tcPr>
-            <w:tcW w:type="dxa" w:w="1414"/>
+            <w:tcW w:type="dxa" w:w="1728"/>
           </w:tcPr>
           <w:p>
             <w:pPr>
@@ -9861,7 +9861,7 @@
           <w:b w:val="0"/>
           <w:i w:val="0"/>
         </w:rPr>
-        <w:t>Given the position of Romania, which records the lowest readiness values and the highest NEET rate in the sample, an additional robustness check was conducted. Cook’s distances identify Romania as the most influential observation in the NEET equations and Sweden in two of the youth unemployment equations. Excluding Romania, the direction of all associations remains unchanged, all four NEET associations remain significant (largest p = 0.000), and all four youth unemployment associations remain insignificant (smallest p = 0.310). These results suggest that the divergence between the two margins is not produced by a single extreme case. The Swedish pattern is nevertheless informative: Sweden combines the highest ICT specialist share in the sample with one of the highest youth unemployment rates, a combination that reflects extensive student job search rather than youth exclusion, and that weakens any cross-sectional association on the unemployment margin.</w:t>
+        <w:t>Given the position of Romania, which records the lowest values on three of the four readiness dimensions and the highest NEET rate in the sample, an additional robustness check was conducted. Cook’s distances identify Romania as the most influential observation in the NEET equations and Sweden in two of the youth unemployment equations. Excluding Romania, all four NEET associations retain their negative direction and remain significant (largest p &lt; 0.001), and all four youth unemployment associations remain insignificant (smallest p = 0.310). These results suggest that the divergence between the two margins is not produced by a single extreme case. The Swedish pattern is nevertheless informative: Sweden combines the highest ICT specialist share in the sample with one of the highest youth unemployment rates, a combination that reflects extensive student job search rather than youth exclusion, and that weakens any cross-sectional association on the unemployment margin.</w:t>
       </w:r>
     </w:p>
     <w:p>
@@ -9921,11 +9921,11 @@
         <w:tblLook w:firstColumn="1" w:firstRow="1" w:lastColumn="0" w:lastRow="0" w:noHBand="0" w:noVBand="1" w:val="04A0"/>
       </w:tblPr>
       <w:tblGrid>
-        <w:gridCol w:w="2357"/>
-        <w:gridCol w:w="1375"/>
-        <w:gridCol w:w="1375"/>
-        <w:gridCol w:w="1375"/>
-        <w:gridCol w:w="1375"/>
+        <w:gridCol w:w="2043"/>
+        <w:gridCol w:w="1453"/>
+        <w:gridCol w:w="1453"/>
+        <w:gridCol w:w="1453"/>
+        <w:gridCol w:w="1453"/>
       </w:tblGrid>
       <w:tr>
         <w:trPr>
@@ -9934,7 +9934,7 @@
         </w:trPr>
         <w:tc>
           <w:tcPr>
-            <w:tcW w:type="dxa" w:w="2357"/>
+            <w:tcW w:type="dxa" w:w="2043"/>
             <w:tcBorders>
               <w:bottom w:val="single" w:sz="8" w:space="0" w:color="auto"/>
             </w:tcBorders>
@@ -9958,7 +9958,7 @@
         </w:tc>
         <w:tc>
           <w:tcPr>
-            <w:tcW w:type="dxa" w:w="1375"/>
+            <w:tcW w:type="dxa" w:w="1453"/>
             <w:tcBorders>
               <w:bottom w:val="single" w:sz="8" w:space="0" w:color="auto"/>
             </w:tcBorders>
@@ -9982,7 +9982,7 @@
         </w:tc>
         <w:tc>
           <w:tcPr>
-            <w:tcW w:type="dxa" w:w="1375"/>
+            <w:tcW w:type="dxa" w:w="1453"/>
             <w:tcBorders>
               <w:bottom w:val="single" w:sz="8" w:space="0" w:color="auto"/>
             </w:tcBorders>
@@ -10006,7 +10006,7 @@
         </w:tc>
         <w:tc>
           <w:tcPr>
-            <w:tcW w:type="dxa" w:w="1375"/>
+            <w:tcW w:type="dxa" w:w="1453"/>
             <w:tcBorders>
               <w:bottom w:val="single" w:sz="8" w:space="0" w:color="auto"/>
             </w:tcBorders>
@@ -10030,7 +10030,7 @@
         </w:tc>
         <w:tc>
           <w:tcPr>
-            <w:tcW w:type="dxa" w:w="1375"/>
+            <w:tcW w:type="dxa" w:w="1453"/>
             <w:tcBorders>
               <w:bottom w:val="single" w:sz="8" w:space="0" w:color="auto"/>
             </w:tcBorders>
@@ -10059,7 +10059,7 @@
         </w:trPr>
         <w:tc>
           <w:tcPr>
-            <w:tcW w:type="dxa" w:w="2357"/>
+            <w:tcW w:type="dxa" w:w="2043"/>
           </w:tcPr>
           <w:p>
             <w:pPr>
@@ -10080,7 +10080,7 @@
         </w:tc>
         <w:tc>
           <w:tcPr>
-            <w:tcW w:type="dxa" w:w="1375"/>
+            <w:tcW w:type="dxa" w:w="1453"/>
           </w:tcPr>
           <w:p>
             <w:pPr>
@@ -10095,13 +10095,13 @@
                 <w:i w:val="0"/>
                 <w:sz w:val="15"/>
               </w:rPr>
-              <w:t>0.414 (p = 0.032)</w:t>
-            </w:r>
-          </w:p>
-        </w:tc>
-        <w:tc>
-          <w:tcPr>
-            <w:tcW w:type="dxa" w:w="1375"/>
+              <w:t>0.414 (p = 0.032)</w:t>
+            </w:r>
+          </w:p>
+        </w:tc>
+        <w:tc>
+          <w:tcPr>
+            <w:tcW w:type="dxa" w:w="1453"/>
           </w:tcPr>
           <w:p>
             <w:pPr>
@@ -10116,13 +10116,13 @@
                 <w:i w:val="0"/>
                 <w:sz w:val="15"/>
               </w:rPr>
-              <w:t>0.635 (p &lt; 0.001)</w:t>
-            </w:r>
-          </w:p>
-        </w:tc>
-        <w:tc>
-          <w:tcPr>
-            <w:tcW w:type="dxa" w:w="1375"/>
+              <w:t>0.635 (p &lt; 0.001)</w:t>
+            </w:r>
+          </w:p>
+        </w:tc>
+        <w:tc>
+          <w:tcPr>
+            <w:tcW w:type="dxa" w:w="1453"/>
           </w:tcPr>
           <w:p>
             <w:pPr>
@@ -10137,13 +10137,13 @@
                 <w:i w:val="0"/>
                 <w:sz w:val="15"/>
               </w:rPr>
-              <w:t>0.474 (p = 0.012)</w:t>
-            </w:r>
-          </w:p>
-        </w:tc>
-        <w:tc>
-          <w:tcPr>
-            <w:tcW w:type="dxa" w:w="1375"/>
+              <w:t>0.474 (p = 0.012)</w:t>
+            </w:r>
+          </w:p>
+        </w:tc>
+        <w:tc>
+          <w:tcPr>
+            <w:tcW w:type="dxa" w:w="1453"/>
           </w:tcPr>
           <w:p>
             <w:pPr>
@@ -10158,7 +10158,7 @@
                 <w:i w:val="0"/>
                 <w:sz w:val="15"/>
               </w:rPr>
-              <w:t>0.515 (p = 0.006)</w:t>
+              <w:t>0.515 (p = 0.006)</w:t>
             </w:r>
           </w:p>
         </w:tc>
@@ -10169,7 +10169,7 @@
         </w:trPr>
         <w:tc>
           <w:tcPr>
-            <w:tcW w:type="dxa" w:w="2357"/>
+            <w:tcW w:type="dxa" w:w="2043"/>
           </w:tcPr>
           <w:p>
             <w:pPr>
@@ -10190,7 +10190,7 @@
         </w:tc>
         <w:tc>
           <w:tcPr>
-            <w:tcW w:type="dxa" w:w="1375"/>
+            <w:tcW w:type="dxa" w:w="1453"/>
           </w:tcPr>
           <w:p>
             <w:pPr>
@@ -10205,13 +10205,13 @@
                 <w:i w:val="0"/>
                 <w:sz w:val="15"/>
               </w:rPr>
-              <w:t>0.570 (p = 0.002)</w:t>
-            </w:r>
-          </w:p>
-        </w:tc>
-        <w:tc>
-          <w:tcPr>
-            <w:tcW w:type="dxa" w:w="1375"/>
+              <w:t>0.570 (p = 0.002)</w:t>
+            </w:r>
+          </w:p>
+        </w:tc>
+        <w:tc>
+          <w:tcPr>
+            <w:tcW w:type="dxa" w:w="1453"/>
           </w:tcPr>
           <w:p>
             <w:pPr>
@@ -10226,13 +10226,13 @@
                 <w:i w:val="0"/>
                 <w:sz w:val="15"/>
               </w:rPr>
-              <w:t>0.472 (p = 0.013)</w:t>
-            </w:r>
-          </w:p>
-        </w:tc>
-        <w:tc>
-          <w:tcPr>
-            <w:tcW w:type="dxa" w:w="1375"/>
+              <w:t>0.472 (p = 0.013)</w:t>
+            </w:r>
+          </w:p>
+        </w:tc>
+        <w:tc>
+          <w:tcPr>
+            <w:tcW w:type="dxa" w:w="1453"/>
           </w:tcPr>
           <w:p>
             <w:pPr>
@@ -10247,13 +10247,13 @@
                 <w:i w:val="0"/>
                 <w:sz w:val="15"/>
               </w:rPr>
-              <w:t>0.305 (p = 0.122)</w:t>
-            </w:r>
-          </w:p>
-        </w:tc>
-        <w:tc>
-          <w:tcPr>
-            <w:tcW w:type="dxa" w:w="1375"/>
+              <w:t>0.305 (p = 0.122)</w:t>
+            </w:r>
+          </w:p>
+        </w:tc>
+        <w:tc>
+          <w:tcPr>
+            <w:tcW w:type="dxa" w:w="1453"/>
           </w:tcPr>
           <w:p>
             <w:pPr>
@@ -10268,7 +10268,7 @@
                 <w:i w:val="0"/>
                 <w:sz w:val="15"/>
               </w:rPr>
-              <w:t>0.643 (p &lt; 0.001)</w:t>
+              <w:t>0.643 (p &lt; 0.001)</w:t>
             </w:r>
           </w:p>
         </w:tc>
@@ -10279,7 +10279,7 @@
         </w:trPr>
         <w:tc>
           <w:tcPr>
-            <w:tcW w:type="dxa" w:w="2357"/>
+            <w:tcW w:type="dxa" w:w="2043"/>
           </w:tcPr>
           <w:p>
             <w:pPr>
@@ -10300,7 +10300,7 @@
         </w:tc>
         <w:tc>
           <w:tcPr>
-            <w:tcW w:type="dxa" w:w="1375"/>
+            <w:tcW w:type="dxa" w:w="1453"/>
           </w:tcPr>
           <w:p>
             <w:pPr>
@@ -10315,13 +10315,13 @@
                 <w:i w:val="0"/>
                 <w:sz w:val="15"/>
               </w:rPr>
-              <w:t>0.679 (p &lt; 0.001)</w:t>
-            </w:r>
-          </w:p>
-        </w:tc>
-        <w:tc>
-          <w:tcPr>
-            <w:tcW w:type="dxa" w:w="1375"/>
+              <w:t>0.679 (p &lt; 0.001)</w:t>
+            </w:r>
+          </w:p>
+        </w:tc>
+        <w:tc>
+          <w:tcPr>
+            <w:tcW w:type="dxa" w:w="1453"/>
           </w:tcPr>
           <w:p>
             <w:pPr>
@@ -10336,13 +10336,13 @@
                 <w:i w:val="0"/>
                 <w:sz w:val="15"/>
               </w:rPr>
-              <w:t>0.502 (p = 0.008)</w:t>
-            </w:r>
-          </w:p>
-        </w:tc>
-        <w:tc>
-          <w:tcPr>
-            <w:tcW w:type="dxa" w:w="1375"/>
+              <w:t>0.502 (p = 0.008)</w:t>
+            </w:r>
+          </w:p>
+        </w:tc>
+        <w:tc>
+          <w:tcPr>
+            <w:tcW w:type="dxa" w:w="1453"/>
           </w:tcPr>
           <w:p>
             <w:pPr>
@@ -10357,13 +10357,13 @@
                 <w:i w:val="0"/>
                 <w:sz w:val="15"/>
               </w:rPr>
-              <w:t>0.461 (p = 0.016)</w:t>
-            </w:r>
-          </w:p>
-        </w:tc>
-        <w:tc>
-          <w:tcPr>
-            <w:tcW w:type="dxa" w:w="1375"/>
+              <w:t>0.461 (p = 0.016)</w:t>
+            </w:r>
+          </w:p>
+        </w:tc>
+        <w:tc>
+          <w:tcPr>
+            <w:tcW w:type="dxa" w:w="1453"/>
           </w:tcPr>
           <w:p>
             <w:pPr>
@@ -10378,7 +10378,7 @@
                 <w:i w:val="0"/>
                 <w:sz w:val="15"/>
               </w:rPr>
-              <w:t>0.454 (p = 0.017)</w:t>
+              <w:t>0.454 (p = 0.017)</w:t>
             </w:r>
           </w:p>
         </w:tc>
@@ -10389,7 +10389,7 @@
         </w:trPr>
         <w:tc>
           <w:tcPr>
-            <w:tcW w:type="dxa" w:w="2357"/>
+            <w:tcW w:type="dxa" w:w="2043"/>
           </w:tcPr>
           <w:p>
             <w:pPr>
@@ -10410,7 +10410,7 @@
         </w:tc>
         <w:tc>
           <w:tcPr>
-            <w:tcW w:type="dxa" w:w="1375"/>
+            <w:tcW w:type="dxa" w:w="1453"/>
           </w:tcPr>
           <w:p>
             <w:pPr>
@@ -10425,13 +10425,13 @@
                 <w:i w:val="0"/>
                 <w:sz w:val="15"/>
               </w:rPr>
-              <w:t>−0.182 (p = 0.363)</w:t>
-            </w:r>
-          </w:p>
-        </w:tc>
-        <w:tc>
-          <w:tcPr>
-            <w:tcW w:type="dxa" w:w="1375"/>
+              <w:t>−0.182 (p = 0.363)</w:t>
+            </w:r>
+          </w:p>
+        </w:tc>
+        <w:tc>
+          <w:tcPr>
+            <w:tcW w:type="dxa" w:w="1453"/>
           </w:tcPr>
           <w:p>
             <w:pPr>
@@ -10446,13 +10446,13 @@
                 <w:i w:val="0"/>
                 <w:sz w:val="15"/>
               </w:rPr>
-              <w:t>−0.321 (p = 0.102)</w:t>
-            </w:r>
-          </w:p>
-        </w:tc>
-        <w:tc>
-          <w:tcPr>
-            <w:tcW w:type="dxa" w:w="1375"/>
+              <w:t>−0.321 (p = 0.102)</w:t>
+            </w:r>
+          </w:p>
+        </w:tc>
+        <w:tc>
+          <w:tcPr>
+            <w:tcW w:type="dxa" w:w="1453"/>
           </w:tcPr>
           <w:p>
             <w:pPr>
@@ -10467,13 +10467,13 @@
                 <w:i w:val="0"/>
                 <w:sz w:val="15"/>
               </w:rPr>
-              <w:t>−0.427 (p = 0.026)</w:t>
-            </w:r>
-          </w:p>
-        </w:tc>
-        <w:tc>
-          <w:tcPr>
-            <w:tcW w:type="dxa" w:w="1375"/>
+              <w:t>−0.427 (p = 0.026)</w:t>
+            </w:r>
+          </w:p>
+        </w:tc>
+        <w:tc>
+          <w:tcPr>
+            <w:tcW w:type="dxa" w:w="1453"/>
           </w:tcPr>
           <w:p>
             <w:pPr>
@@ -10488,7 +10488,7 @@
                 <w:i w:val="0"/>
                 <w:sz w:val="15"/>
               </w:rPr>
-              <w:t>−0.032 (p = 0.875)</w:t>
+              <w:t>−0.032 (p = 0.875)</w:t>
             </w:r>
           </w:p>
         </w:tc>
@@ -10798,7 +10798,7 @@
                 <w:i w:val="0"/>
                 <w:sz w:val="18"/>
               </w:rPr>
-              <w:t>χ2 = 88.185; df = 6; p &lt; 0.001</w:t>
+              <w:t>χ2 = 88.185; df = 6; p &lt; 0.001</w:t>
             </w:r>
           </w:p>
         </w:tc>
@@ -11855,7 +11855,7 @@
           <w:b w:val="0"/>
           <w:i w:val="0"/>
         </w:rPr>
-        <w:t>The first regression analyzed the relationship between the latent factor and the youth NEET rate. The model indicates a negative and statistically significant relationship, with a correlation coefficient of 0.802 and an explanatory capacity of approximately 64% of the variation in the share of disengaged young people (R-squared = 0.643; adjusted R-squared = 0.629). The F test indicates that the model is statistically significant (F = 45.12, p &lt; 0.001). The regression coefficient indicates that, on average, a one-unit increase in the factor score is associated with a decrease of around 2.49 percentage points in the NEET rate (B = −2.487, beta = −0.802). Given the cross-sectional structure of the data and the absence of a meaningful ordering of countries, no autocorrelation interpretation is reported (Table 8).</w:t>
+        <w:t>The first regression analyzed the relationship between the latent factor and the youth NEET rate. The model indicates a negative and statistically significant relationship, with a correlation coefficient of −0.802 and an explanatory capacity of approximately 64% of the variation in the share of disengaged young people (R-squared = 0.643; adjusted R-squared = 0.629). The F test indicates that the model is statistically significant (F = 45.12, p &lt; 0.001). The regression coefficient indicates that, on average, a one-unit increase in the factor score is associated with a decrease of around 2.49 percentage points in the NEET rate (B = −2.487, beta = −0.802). Given the cross-sectional structure of the data and the absence of a meaningful ordering of countries, no autocorrelation interpretation is reported (Table 8).</w:t>
       </w:r>
     </w:p>
     <w:p>
@@ -15675,7 +15675,7 @@
           <w:b w:val="0"/>
           <w:i w:val="0"/>
         </w:rPr>
-        <w:t xml:space="preserve">Table A1 in Appendix A shows the composition of the two clusters, with a strong concentration of Nordic, Western, and Alpine-Adriatic economies in the higher-readiness category, joined by the Baltic states of Estonia and the island economy of Malta. The second cluster is primarily composed of Southern, Central, and South-Eastern European countries, together with France, whose enterprise adoption rate remains below the EU average. From the perspective of complex adaptive systems, these patterns show how interactions among technology, human capital, and institutional frameworks produce persistent, emerging configurations </w:t>
+        <w:t xml:space="preserve">Table A1 in Appendix A shows the composition of the two clusters, with a strong concentration of Nordic, Western, and Alpine-Adriatic economies in the higher-readiness category, joined by the Baltic state of Estonia and the island economy of Malta. The second cluster is primarily composed of Southern, Central, and South-Eastern European countries, joined by the remaining Baltic states of Latvia and Lithuania and by France, whose enterprise adoption rate remains below the EU average. From the perspective of complex adaptive systems, these patterns show how interactions among technology, human capital, and institutional frameworks produce persistent, emerging configurations </w:t>
       </w:r>
       <w:r>
         <w:t>[</w:t>
@@ -17014,6 +17014,660 @@
         <w:t>The authors declare no conflicts of interest.</w:t>
       </w:r>
     </w:p>
+    <w:p>
+      <w:pPr>
+        <w:pStyle w:val="MDPI62backmatter"/>
+        <w:spacing w:before="120"/>
+      </w:pPr>
+      <w:r>
+        <w:rPr>
+          <w:b/>
+          <w:sz w:val="18"/>
+        </w:rPr>
+        <w:t xml:space="preserve">Abbreviations: </w:t>
+      </w:r>
+      <w:r>
+        <w:rPr>
+          <w:b w:val="0"/>
+          <w:i w:val="0"/>
+          <w:sz w:val="18"/>
+        </w:rPr>
+        <w:t>The following abbreviations are used in this manuscript:</w:t>
+      </w:r>
+    </w:p>
+    <w:tbl>
+      <w:tblPr>
+        <w:tblW w:w="10466" w:type="dxa"/>
+        <w:tblBorders>
+          <w:top w:val="none" w:sz="0" w:space="0" w:color="auto"/>
+          <w:left w:val="none" w:sz="0" w:space="0" w:color="auto"/>
+          <w:bottom w:val="none" w:sz="0" w:space="0" w:color="auto"/>
+          <w:right w:val="none" w:sz="0" w:space="0" w:color="auto"/>
+          <w:insideH w:val="none" w:sz="0" w:space="0" w:color="auto"/>
+          <w:insideV w:val="none" w:sz="0" w:space="0" w:color="auto"/>
+        </w:tblBorders>
+        <w:tblLayout w:type="fixed"/>
+        <w:tblCellMar>
+          <w:top w:w="0" w:type="dxa"/>
+          <w:left w:w="0" w:type="dxa"/>
+          <w:bottom w:w="0" w:type="dxa"/>
+          <w:right w:w="0" w:type="dxa"/>
+        </w:tblCellMar>
+        <w:tblLook w:firstColumn="1" w:firstRow="1" w:lastColumn="0" w:lastRow="0" w:noHBand="0" w:noVBand="1" w:val="04A0"/>
+      </w:tblPr>
+      <w:tblGrid>
+        <w:gridCol w:w="1500"/>
+        <w:gridCol w:w="8966"/>
+      </w:tblGrid>
+      <w:tr>
+        <w:tc>
+          <w:tcPr>
+            <w:tcW w:type="dxa" w:w="1500"/>
+          </w:tcPr>
+          <w:p>
+            <w:pPr>
+              <w:pStyle w:val="MDPI62backmatter"/>
+              <w:spacing w:line="240" w:lineRule="auto" w:before="0" w:after="20"/>
+              <w:ind w:left="0" w:firstLine="0"/>
+            </w:pPr>
+            <w:r>
+              <w:rPr>
+                <w:sz w:val="18"/>
+              </w:rPr>
+              <w:t>AI</w:t>
+            </w:r>
+          </w:p>
+        </w:tc>
+        <w:tc>
+          <w:tcPr>
+            <w:tcW w:type="dxa" w:w="8966"/>
+          </w:tcPr>
+          <w:p>
+            <w:pPr>
+              <w:pStyle w:val="MDPI62backmatter"/>
+              <w:spacing w:line="240" w:lineRule="auto" w:before="0" w:after="20"/>
+              <w:ind w:left="0" w:firstLine="0"/>
+            </w:pPr>
+            <w:r>
+              <w:rPr>
+                <w:sz w:val="18"/>
+              </w:rPr>
+              <w:t>Artificial intelligence</w:t>
+            </w:r>
+          </w:p>
+        </w:tc>
+      </w:tr>
+      <w:tr>
+        <w:tc>
+          <w:tcPr>
+            <w:tcW w:type="dxa" w:w="1500"/>
+          </w:tcPr>
+          <w:p>
+            <w:pPr>
+              <w:pStyle w:val="MDPI62backmatter"/>
+              <w:spacing w:line="240" w:lineRule="auto" w:before="0" w:after="20"/>
+              <w:ind w:left="0" w:firstLine="0"/>
+            </w:pPr>
+            <w:r>
+              <w:rPr>
+                <w:sz w:val="18"/>
+              </w:rPr>
+              <w:t>AIENT</w:t>
+            </w:r>
+          </w:p>
+        </w:tc>
+        <w:tc>
+          <w:tcPr>
+            <w:tcW w:type="dxa" w:w="8966"/>
+          </w:tcPr>
+          <w:p>
+            <w:pPr>
+              <w:pStyle w:val="MDPI62backmatter"/>
+              <w:spacing w:line="240" w:lineRule="auto" w:before="0" w:after="20"/>
+              <w:ind w:left="0" w:firstLine="0"/>
+            </w:pPr>
+            <w:r>
+              <w:rPr>
+                <w:sz w:val="18"/>
+              </w:rPr>
+              <w:t>Enterprises using at least one AI technology, percentage of enterprises</w:t>
+            </w:r>
+          </w:p>
+        </w:tc>
+      </w:tr>
+      <w:tr>
+        <w:tc>
+          <w:tcPr>
+            <w:tcW w:type="dxa" w:w="1500"/>
+          </w:tcPr>
+          <w:p>
+            <w:pPr>
+              <w:pStyle w:val="MDPI62backmatter"/>
+              <w:spacing w:line="240" w:lineRule="auto" w:before="0" w:after="20"/>
+              <w:ind w:left="0" w:firstLine="0"/>
+            </w:pPr>
+            <w:r>
+              <w:rPr>
+                <w:sz w:val="18"/>
+              </w:rPr>
+              <w:t>ANOVA</w:t>
+            </w:r>
+          </w:p>
+        </w:tc>
+        <w:tc>
+          <w:tcPr>
+            <w:tcW w:type="dxa" w:w="8966"/>
+          </w:tcPr>
+          <w:p>
+            <w:pPr>
+              <w:pStyle w:val="MDPI62backmatter"/>
+              <w:spacing w:line="240" w:lineRule="auto" w:before="0" w:after="20"/>
+              <w:ind w:left="0" w:firstLine="0"/>
+            </w:pPr>
+            <w:r>
+              <w:rPr>
+                <w:sz w:val="18"/>
+              </w:rPr>
+              <w:t>Analysis of variance</w:t>
+            </w:r>
+          </w:p>
+        </w:tc>
+      </w:tr>
+      <w:tr>
+        <w:tc>
+          <w:tcPr>
+            <w:tcW w:type="dxa" w:w="1500"/>
+          </w:tcPr>
+          <w:p>
+            <w:pPr>
+              <w:pStyle w:val="MDPI62backmatter"/>
+              <w:spacing w:line="240" w:lineRule="auto" w:before="0" w:after="20"/>
+              <w:ind w:left="0" w:firstLine="0"/>
+            </w:pPr>
+            <w:r>
+              <w:rPr>
+                <w:sz w:val="18"/>
+              </w:rPr>
+              <w:t>DSKY</w:t>
+            </w:r>
+          </w:p>
+        </w:tc>
+        <w:tc>
+          <w:tcPr>
+            <w:tcW w:type="dxa" w:w="8966"/>
+          </w:tcPr>
+          <w:p>
+            <w:pPr>
+              <w:pStyle w:val="MDPI62backmatter"/>
+              <w:spacing w:line="240" w:lineRule="auto" w:before="0" w:after="20"/>
+              <w:ind w:left="0" w:firstLine="0"/>
+            </w:pPr>
+            <w:r>
+              <w:rPr>
+                <w:sz w:val="18"/>
+              </w:rPr>
+              <w:t>Young people with basic or above-basic overall digital skills, percentage</w:t>
+            </w:r>
+          </w:p>
+        </w:tc>
+      </w:tr>
+      <w:tr>
+        <w:tc>
+          <w:tcPr>
+            <w:tcW w:type="dxa" w:w="1500"/>
+          </w:tcPr>
+          <w:p>
+            <w:pPr>
+              <w:pStyle w:val="MDPI62backmatter"/>
+              <w:spacing w:line="240" w:lineRule="auto" w:before="0" w:after="20"/>
+              <w:ind w:left="0" w:firstLine="0"/>
+            </w:pPr>
+            <w:r>
+              <w:rPr>
+                <w:sz w:val="18"/>
+              </w:rPr>
+              <w:t>ELET</w:t>
+            </w:r>
+          </w:p>
+        </w:tc>
+        <w:tc>
+          <w:tcPr>
+            <w:tcW w:type="dxa" w:w="8966"/>
+          </w:tcPr>
+          <w:p>
+            <w:pPr>
+              <w:pStyle w:val="MDPI62backmatter"/>
+              <w:spacing w:line="240" w:lineRule="auto" w:before="0" w:after="20"/>
+              <w:ind w:left="0" w:firstLine="0"/>
+            </w:pPr>
+            <w:r>
+              <w:rPr>
+                <w:sz w:val="18"/>
+              </w:rPr>
+              <w:t>Early leavers from education and training, percentage</w:t>
+            </w:r>
+          </w:p>
+        </w:tc>
+      </w:tr>
+      <w:tr>
+        <w:tc>
+          <w:tcPr>
+            <w:tcW w:type="dxa" w:w="1500"/>
+          </w:tcPr>
+          <w:p>
+            <w:pPr>
+              <w:pStyle w:val="MDPI62backmatter"/>
+              <w:spacing w:line="240" w:lineRule="auto" w:before="0" w:after="20"/>
+              <w:ind w:left="0" w:firstLine="0"/>
+            </w:pPr>
+            <w:r>
+              <w:rPr>
+                <w:sz w:val="18"/>
+              </w:rPr>
+              <w:t>EU</w:t>
+            </w:r>
+          </w:p>
+        </w:tc>
+        <w:tc>
+          <w:tcPr>
+            <w:tcW w:type="dxa" w:w="8966"/>
+          </w:tcPr>
+          <w:p>
+            <w:pPr>
+              <w:pStyle w:val="MDPI62backmatter"/>
+              <w:spacing w:line="240" w:lineRule="auto" w:before="0" w:after="20"/>
+              <w:ind w:left="0" w:firstLine="0"/>
+            </w:pPr>
+            <w:r>
+              <w:rPr>
+                <w:sz w:val="18"/>
+              </w:rPr>
+              <w:t>European Union</w:t>
+            </w:r>
+          </w:p>
+        </w:tc>
+      </w:tr>
+      <w:tr>
+        <w:tc>
+          <w:tcPr>
+            <w:tcW w:type="dxa" w:w="1500"/>
+          </w:tcPr>
+          <w:p>
+            <w:pPr>
+              <w:pStyle w:val="MDPI62backmatter"/>
+              <w:spacing w:line="240" w:lineRule="auto" w:before="0" w:after="20"/>
+              <w:ind w:left="0" w:firstLine="0"/>
+            </w:pPr>
+            <w:r>
+              <w:rPr>
+                <w:sz w:val="18"/>
+              </w:rPr>
+              <w:t>FACT_AIR</w:t>
+            </w:r>
+          </w:p>
+        </w:tc>
+        <w:tc>
+          <w:tcPr>
+            <w:tcW w:type="dxa" w:w="8966"/>
+          </w:tcPr>
+          <w:p>
+            <w:pPr>
+              <w:pStyle w:val="MDPI62backmatter"/>
+              <w:spacing w:line="240" w:lineRule="auto" w:before="0" w:after="20"/>
+              <w:ind w:left="0" w:firstLine="0"/>
+            </w:pPr>
+            <w:r>
+              <w:rPr>
+                <w:sz w:val="18"/>
+              </w:rPr>
+              <w:t>Latent factor score of artificial intelligence readiness</w:t>
+            </w:r>
+          </w:p>
+        </w:tc>
+      </w:tr>
+      <w:tr>
+        <w:tc>
+          <w:tcPr>
+            <w:tcW w:type="dxa" w:w="1500"/>
+          </w:tcPr>
+          <w:p>
+            <w:pPr>
+              <w:pStyle w:val="MDPI62backmatter"/>
+              <w:spacing w:line="240" w:lineRule="auto" w:before="0" w:after="20"/>
+              <w:ind w:left="0" w:firstLine="0"/>
+            </w:pPr>
+            <w:r>
+              <w:rPr>
+                <w:sz w:val="18"/>
+              </w:rPr>
+              <w:t>GAIY</w:t>
+            </w:r>
+          </w:p>
+        </w:tc>
+        <w:tc>
+          <w:tcPr>
+            <w:tcW w:type="dxa" w:w="8966"/>
+          </w:tcPr>
+          <w:p>
+            <w:pPr>
+              <w:pStyle w:val="MDPI62backmatter"/>
+              <w:spacing w:line="240" w:lineRule="auto" w:before="0" w:after="20"/>
+              <w:ind w:left="0" w:firstLine="0"/>
+            </w:pPr>
+            <w:r>
+              <w:rPr>
+                <w:sz w:val="18"/>
+              </w:rPr>
+              <w:t>Young individuals who used generative AI tools in the last three months, percentage</w:t>
+            </w:r>
+          </w:p>
+        </w:tc>
+      </w:tr>
+      <w:tr>
+        <w:tc>
+          <w:tcPr>
+            <w:tcW w:type="dxa" w:w="1500"/>
+          </w:tcPr>
+          <w:p>
+            <w:pPr>
+              <w:pStyle w:val="MDPI62backmatter"/>
+              <w:spacing w:line="240" w:lineRule="auto" w:before="0" w:after="20"/>
+              <w:ind w:left="0" w:firstLine="0"/>
+            </w:pPr>
+            <w:r>
+              <w:rPr>
+                <w:sz w:val="18"/>
+              </w:rPr>
+              <w:t>GDPC</w:t>
+            </w:r>
+          </w:p>
+        </w:tc>
+        <w:tc>
+          <w:tcPr>
+            <w:tcW w:type="dxa" w:w="8966"/>
+          </w:tcPr>
+          <w:p>
+            <w:pPr>
+              <w:pStyle w:val="MDPI62backmatter"/>
+              <w:spacing w:line="240" w:lineRule="auto" w:before="0" w:after="20"/>
+              <w:ind w:left="0" w:firstLine="0"/>
+            </w:pPr>
+            <w:r>
+              <w:rPr>
+                <w:sz w:val="18"/>
+              </w:rPr>
+              <w:t>GDP per capita in purchasing power standards</w:t>
+            </w:r>
+          </w:p>
+        </w:tc>
+      </w:tr>
+      <w:tr>
+        <w:tc>
+          <w:tcPr>
+            <w:tcW w:type="dxa" w:w="1500"/>
+          </w:tcPr>
+          <w:p>
+            <w:pPr>
+              <w:pStyle w:val="MDPI62backmatter"/>
+              <w:spacing w:line="240" w:lineRule="auto" w:before="0" w:after="20"/>
+              <w:ind w:left="0" w:firstLine="0"/>
+            </w:pPr>
+            <w:r>
+              <w:rPr>
+                <w:sz w:val="18"/>
+              </w:rPr>
+              <w:t>ICT</w:t>
+            </w:r>
+          </w:p>
+        </w:tc>
+        <w:tc>
+          <w:tcPr>
+            <w:tcW w:type="dxa" w:w="8966"/>
+          </w:tcPr>
+          <w:p>
+            <w:pPr>
+              <w:pStyle w:val="MDPI62backmatter"/>
+              <w:spacing w:line="240" w:lineRule="auto" w:before="0" w:after="20"/>
+              <w:ind w:left="0" w:firstLine="0"/>
+            </w:pPr>
+            <w:r>
+              <w:rPr>
+                <w:sz w:val="18"/>
+              </w:rPr>
+              <w:t>Information and communication technologies</w:t>
+            </w:r>
+          </w:p>
+        </w:tc>
+      </w:tr>
+      <w:tr>
+        <w:tc>
+          <w:tcPr>
+            <w:tcW w:type="dxa" w:w="1500"/>
+          </w:tcPr>
+          <w:p>
+            <w:pPr>
+              <w:pStyle w:val="MDPI62backmatter"/>
+              <w:spacing w:line="240" w:lineRule="auto" w:before="0" w:after="20"/>
+              <w:ind w:left="0" w:firstLine="0"/>
+            </w:pPr>
+            <w:r>
+              <w:rPr>
+                <w:sz w:val="18"/>
+              </w:rPr>
+              <w:t>ICTS</w:t>
+            </w:r>
+          </w:p>
+        </w:tc>
+        <w:tc>
+          <w:tcPr>
+            <w:tcW w:type="dxa" w:w="8966"/>
+          </w:tcPr>
+          <w:p>
+            <w:pPr>
+              <w:pStyle w:val="MDPI62backmatter"/>
+              <w:spacing w:line="240" w:lineRule="auto" w:before="0" w:after="20"/>
+              <w:ind w:left="0" w:firstLine="0"/>
+            </w:pPr>
+            <w:r>
+              <w:rPr>
+                <w:sz w:val="18"/>
+              </w:rPr>
+              <w:t>ICT specialists, percentage of total employment</w:t>
+            </w:r>
+          </w:p>
+        </w:tc>
+      </w:tr>
+      <w:tr>
+        <w:tc>
+          <w:tcPr>
+            <w:tcW w:type="dxa" w:w="1500"/>
+          </w:tcPr>
+          <w:p>
+            <w:pPr>
+              <w:pStyle w:val="MDPI62backmatter"/>
+              <w:spacing w:line="240" w:lineRule="auto" w:before="0" w:after="20"/>
+              <w:ind w:left="0" w:firstLine="0"/>
+            </w:pPr>
+            <w:r>
+              <w:rPr>
+                <w:sz w:val="18"/>
+              </w:rPr>
+              <w:t>KMO</w:t>
+            </w:r>
+          </w:p>
+        </w:tc>
+        <w:tc>
+          <w:tcPr>
+            <w:tcW w:type="dxa" w:w="8966"/>
+          </w:tcPr>
+          <w:p>
+            <w:pPr>
+              <w:pStyle w:val="MDPI62backmatter"/>
+              <w:spacing w:line="240" w:lineRule="auto" w:before="0" w:after="20"/>
+              <w:ind w:left="0" w:firstLine="0"/>
+            </w:pPr>
+            <w:r>
+              <w:rPr>
+                <w:sz w:val="18"/>
+              </w:rPr>
+              <w:t>Kaiser–Meyer–Olkin measure of sampling adequacy</w:t>
+            </w:r>
+          </w:p>
+        </w:tc>
+      </w:tr>
+      <w:tr>
+        <w:tc>
+          <w:tcPr>
+            <w:tcW w:type="dxa" w:w="1500"/>
+          </w:tcPr>
+          <w:p>
+            <w:pPr>
+              <w:pStyle w:val="MDPI62backmatter"/>
+              <w:spacing w:line="240" w:lineRule="auto" w:before="0" w:after="20"/>
+              <w:ind w:left="0" w:firstLine="0"/>
+            </w:pPr>
+            <w:r>
+              <w:rPr>
+                <w:sz w:val="18"/>
+              </w:rPr>
+              <w:t>NEET</w:t>
+            </w:r>
+          </w:p>
+        </w:tc>
+        <w:tc>
+          <w:tcPr>
+            <w:tcW w:type="dxa" w:w="8966"/>
+          </w:tcPr>
+          <w:p>
+            <w:pPr>
+              <w:pStyle w:val="MDPI62backmatter"/>
+              <w:spacing w:line="240" w:lineRule="auto" w:before="0" w:after="20"/>
+              <w:ind w:left="0" w:firstLine="0"/>
+            </w:pPr>
+            <w:r>
+              <w:rPr>
+                <w:sz w:val="18"/>
+              </w:rPr>
+              <w:t>Young people neither in employment nor in education and training, percentage</w:t>
+            </w:r>
+          </w:p>
+        </w:tc>
+      </w:tr>
+      <w:tr>
+        <w:tc>
+          <w:tcPr>
+            <w:tcW w:type="dxa" w:w="1500"/>
+          </w:tcPr>
+          <w:p>
+            <w:pPr>
+              <w:pStyle w:val="MDPI62backmatter"/>
+              <w:spacing w:line="240" w:lineRule="auto" w:before="0" w:after="20"/>
+              <w:ind w:left="0" w:firstLine="0"/>
+            </w:pPr>
+            <w:r>
+              <w:rPr>
+                <w:sz w:val="18"/>
+              </w:rPr>
+              <w:t>RDI</w:t>
+            </w:r>
+          </w:p>
+        </w:tc>
+        <w:tc>
+          <w:tcPr>
+            <w:tcW w:type="dxa" w:w="8966"/>
+          </w:tcPr>
+          <w:p>
+            <w:pPr>
+              <w:pStyle w:val="MDPI62backmatter"/>
+              <w:spacing w:line="240" w:lineRule="auto" w:before="0" w:after="20"/>
+              <w:ind w:left="0" w:firstLine="0"/>
+            </w:pPr>
+            <w:r>
+              <w:rPr>
+                <w:sz w:val="18"/>
+              </w:rPr>
+              <w:t>Gross domestic expenditure on R&amp;D, percentage of GDP</w:t>
+            </w:r>
+          </w:p>
+        </w:tc>
+      </w:tr>
+      <w:tr>
+        <w:tc>
+          <w:tcPr>
+            <w:tcW w:type="dxa" w:w="1500"/>
+          </w:tcPr>
+          <w:p>
+            <w:pPr>
+              <w:pStyle w:val="MDPI62backmatter"/>
+              <w:spacing w:line="240" w:lineRule="auto" w:before="0" w:after="20"/>
+              <w:ind w:left="0" w:firstLine="0"/>
+            </w:pPr>
+            <w:r>
+              <w:rPr>
+                <w:sz w:val="18"/>
+              </w:rPr>
+              <w:t>TERT</w:t>
+            </w:r>
+          </w:p>
+        </w:tc>
+        <w:tc>
+          <w:tcPr>
+            <w:tcW w:type="dxa" w:w="8966"/>
+          </w:tcPr>
+          <w:p>
+            <w:pPr>
+              <w:pStyle w:val="MDPI62backmatter"/>
+              <w:spacing w:line="240" w:lineRule="auto" w:before="0" w:after="20"/>
+              <w:ind w:left="0" w:firstLine="0"/>
+            </w:pPr>
+            <w:r>
+              <w:rPr>
+                <w:sz w:val="18"/>
+              </w:rPr>
+              <w:t>Tertiary educational attainment, percentage of the population aged 25–34</w:t>
+            </w:r>
+          </w:p>
+        </w:tc>
+      </w:tr>
+      <w:tr>
+        <w:tc>
+          <w:tcPr>
+            <w:tcW w:type="dxa" w:w="1500"/>
+          </w:tcPr>
+          <w:p>
+            <w:pPr>
+              <w:pStyle w:val="MDPI62backmatter"/>
+              <w:spacing w:line="240" w:lineRule="auto" w:before="0" w:after="20"/>
+              <w:ind w:left="0" w:firstLine="0"/>
+            </w:pPr>
+            <w:r>
+              <w:rPr>
+                <w:sz w:val="18"/>
+              </w:rPr>
+              <w:t>YUR</w:t>
+            </w:r>
+          </w:p>
+        </w:tc>
+        <w:tc>
+          <w:tcPr>
+            <w:tcW w:type="dxa" w:w="8966"/>
+          </w:tcPr>
+          <w:p>
+            <w:pPr>
+              <w:pStyle w:val="MDPI62backmatter"/>
+              <w:spacing w:line="240" w:lineRule="auto" w:before="0" w:after="20"/>
+              <w:ind w:left="0" w:firstLine="0"/>
+            </w:pPr>
+            <w:r>
+              <w:rPr>
+                <w:sz w:val="18"/>
+              </w:rPr>
+              <w:t>Youth unemployment rate, percentage</w:t>
+            </w:r>
+          </w:p>
+        </w:tc>
+      </w:tr>
+    </w:tbl>
     <w:p>
       <w:pPr>
         <w:pStyle w:val="MDPI21heading1"/>
@@ -22307,15 +22961,15 @@
           <w:i w:val="0"/>
           <w:sz w:val="18"/>
         </w:rPr>
-        <w:t xml:space="preserve">; De Grip, A.; Van Loo, J.; Mayhew, K.; </w:t>
-      </w:r>
-      <w:r>
-        <w:rPr>
-          <w:b w:val="0"/>
-          <w:i w:val="0"/>
-          <w:sz w:val="18"/>
-        </w:rPr>
-        <w:t>Emerald: Bingley, UK, 2002; 1–26.</w:t>
+        <w:t xml:space="preserve">; De Grip, A., Van Loo, J., Mayhew, K., Eds.; </w:t>
+      </w:r>
+      <w:r>
+        <w:rPr>
+          <w:b w:val="0"/>
+          <w:i w:val="0"/>
+          <w:sz w:val="18"/>
+        </w:rPr>
+        <w:t>JAI/Elsevier Science: Amsterdam, The Netherlands, 2002; pp. 1–26.</w:t>
       </w:r>
     </w:p>
     <w:p>
@@ -24517,15 +25171,15 @@
           <w:i w:val="0"/>
           <w:sz w:val="18"/>
         </w:rPr>
-        <w:t xml:space="preserve">Use of Generative Artificial Intelligence Tools by Individuals, ICT Usage in Households and by Individuals Survey 2025. </w:t>
-      </w:r>
-      <w:r>
-        <w:rPr>
-          <w:b w:val="0"/>
-          <w:i w:val="0"/>
-          <w:sz w:val="18"/>
-        </w:rPr>
-        <w:t>Available online: https://ec.europa.eu/eurostat/web/digital-economy-and-society/database (accessed on 17 August 2026).</w:t>
+        <w:t xml:space="preserve">Use of Generative Artificial Intelligence Tools by Individuals, ICT Usage in Households and by Individuals Survey 2025 (isoc_ci_ax_i). </w:t>
+      </w:r>
+      <w:r>
+        <w:rPr>
+          <w:b w:val="0"/>
+          <w:i w:val="0"/>
+          <w:sz w:val="18"/>
+        </w:rPr>
+        <w:t>Available online: https://ec.europa.eu/eurostat/databrowser/view/isoc_ci_ax_i/default/table (accessed on 17 August 2026).</w:t>
       </w:r>
     </w:p>
     <w:p>
@@ -24817,15 +25471,15 @@
           <w:i w:val="0"/>
           <w:sz w:val="18"/>
         </w:rPr>
-        <w:t xml:space="preserve">GDP per Capita in Purchasing Power Standards (prc_ppp_ind). </w:t>
-      </w:r>
-      <w:r>
-        <w:rPr>
-          <w:b w:val="0"/>
-          <w:i w:val="0"/>
-          <w:sz w:val="18"/>
-        </w:rPr>
-        <w:t>Available online: https://ec.europa.eu/eurostat/databrowser/view/prc_ppp_ind/default/table (accessed on 17 August 2026).</w:t>
+        <w:t xml:space="preserve">GDP per Capita in Purchasing Power Standards (tec00114). </w:t>
+      </w:r>
+      <w:r>
+        <w:rPr>
+          <w:b w:val="0"/>
+          <w:i w:val="0"/>
+          <w:sz w:val="18"/>
+        </w:rPr>
+        <w:t>Available online: https://ec.europa.eu/eurostat/databrowser/view/tec00114/default/table (accessed on 17 August 2026).</w:t>
       </w:r>
     </w:p>
     <w:p>
@@ -28622,6 +29276,8 @@
     <w:qFormat/>
     <w:rsid w:val="003D34A1"/>
     <w:pPr>
+      <w:keepNext/>
+      <w:keepLines/>
       <w:adjustRightInd w:val="0"/>
       <w:snapToGrid w:val="0"/>
       <w:spacing w:before="60" w:after="60" w:line="280" w:lineRule="atLeast"/>
@@ -28641,6 +29297,8 @@
     <w:qFormat/>
     <w:rsid w:val="003D34A1"/>
     <w:pPr>
+      <w:keepNext/>
+      <w:keepLines/>
       <w:adjustRightInd w:val="0"/>
       <w:snapToGrid w:val="0"/>
       <w:spacing w:before="240" w:after="60" w:line="280" w:lineRule="atLeast"/>
@@ -28662,6 +29320,8 @@
     <w:qFormat/>
     <w:rsid w:val="003D34A1"/>
     <w:pPr>
+      <w:keepNext/>
+      <w:keepLines/>
       <w:adjustRightInd w:val="0"/>
       <w:snapToGrid w:val="0"/>
       <w:spacing w:before="60" w:after="60" w:line="280" w:lineRule="atLeast"/>

</xml_diff>